<commit_message>
changed the Requirements.docx to match the new ideas after discussing with teacher
</commit_message>
<xml_diff>
--- a/docs/Requirements.docx
+++ b/docs/Requirements.docx
@@ -1,6 +1,6 @@
 
 <file path=word/document.xml><?xml version="1.0" encoding="utf-8"?>
-<w:document xmlns:wpc="http://schemas.microsoft.com/office/word/2010/wordprocessingCanvas" xmlns:cx="http://schemas.microsoft.com/office/drawing/2014/chartex" xmlns:cx1="http://schemas.microsoft.com/office/drawing/2015/9/8/chartex" xmlns:cx2="http://schemas.microsoft.com/office/drawing/2015/10/21/chartex" xmlns:cx3="http://schemas.microsoft.com/office/drawing/2016/5/9/chartex" xmlns:cx4="http://schemas.microsoft.com/office/drawing/2016/5/10/chartex" xmlns:cx5="http://schemas.microsoft.com/office/drawing/2016/5/11/chartex" xmlns:cx6="http://schemas.microsoft.com/office/drawing/2016/5/12/chartex" xmlns:cx7="http://schemas.microsoft.com/office/drawing/2016/5/13/chartex" xmlns:cx8="http://schemas.microsoft.com/office/drawing/2016/5/14/chartex" xmlns:mc="http://schemas.openxmlformats.org/markup-compatibility/2006" xmlns:aink="http://schemas.microsoft.com/office/drawing/2016/ink" xmlns:am3d="http://schemas.microsoft.com/office/drawing/2017/model3d" xmlns:o="urn:schemas-microsoft-com:office:office" xmlns:r="http://schemas.openxmlformats.org/officeDocument/2006/relationships" xmlns:m="http://schemas.openxmlformats.org/officeDocument/2006/math" xmlns:v="urn:schemas-microsoft-com:vml" xmlns:wp14="http://schemas.microsoft.com/office/word/2010/wordprocessingDrawing" xmlns:wp="http://schemas.openxmlformats.org/drawingml/2006/wordprocessingDrawing" xmlns:w10="urn:schemas-microsoft-com:office:word" xmlns:w="http://schemas.openxmlformats.org/wordprocessingml/2006/main" xmlns:w14="http://schemas.microsoft.com/office/word/2010/wordml" xmlns:w15="http://schemas.microsoft.com/office/word/2012/wordml" xmlns:w16cex="http://schemas.microsoft.com/office/word/2018/wordml/cex" xmlns:w16cid="http://schemas.microsoft.com/office/word/2016/wordml/cid" xmlns:w16="http://schemas.microsoft.com/office/word/2018/wordml" xmlns:w16sdtdh="http://schemas.microsoft.com/office/word/2020/wordml/sdtdatahash" xmlns:w16se="http://schemas.microsoft.com/office/word/2015/wordml/symex" xmlns:wpg="http://schemas.microsoft.com/office/word/2010/wordprocessingGroup" xmlns:wpi="http://schemas.microsoft.com/office/word/2010/wordprocessingInk" xmlns:wne="http://schemas.microsoft.com/office/word/2006/wordml" xmlns:wps="http://schemas.microsoft.com/office/word/2010/wordprocessingShape" mc:Ignorable="w14 w15 w16se w16cid w16 w16cex w16sdtdh wp14">
+<w:document xmlns:wpc="http://schemas.microsoft.com/office/word/2010/wordprocessingCanvas" xmlns:cx="http://schemas.microsoft.com/office/drawing/2014/chartex" xmlns:cx1="http://schemas.microsoft.com/office/drawing/2015/9/8/chartex" xmlns:cx2="http://schemas.microsoft.com/office/drawing/2015/10/21/chartex" xmlns:cx3="http://schemas.microsoft.com/office/drawing/2016/5/9/chartex" xmlns:cx4="http://schemas.microsoft.com/office/drawing/2016/5/10/chartex" xmlns:cx5="http://schemas.microsoft.com/office/drawing/2016/5/11/chartex" xmlns:cx6="http://schemas.microsoft.com/office/drawing/2016/5/12/chartex" xmlns:cx7="http://schemas.microsoft.com/office/drawing/2016/5/13/chartex" xmlns:cx8="http://schemas.microsoft.com/office/drawing/2016/5/14/chartex" xmlns:mc="http://schemas.openxmlformats.org/markup-compatibility/2006" xmlns:aink="http://schemas.microsoft.com/office/drawing/2016/ink" xmlns:am3d="http://schemas.microsoft.com/office/drawing/2017/model3d" xmlns:o="urn:schemas-microsoft-com:office:office" xmlns:oel="http://schemas.microsoft.com/office/2019/extlst" xmlns:r="http://schemas.openxmlformats.org/officeDocument/2006/relationships" xmlns:m="http://schemas.openxmlformats.org/officeDocument/2006/math" xmlns:v="urn:schemas-microsoft-com:vml" xmlns:wp14="http://schemas.microsoft.com/office/word/2010/wordprocessingDrawing" xmlns:wp="http://schemas.openxmlformats.org/drawingml/2006/wordprocessingDrawing" xmlns:w10="urn:schemas-microsoft-com:office:word" xmlns:w="http://schemas.openxmlformats.org/wordprocessingml/2006/main" xmlns:w14="http://schemas.microsoft.com/office/word/2010/wordml" xmlns:w15="http://schemas.microsoft.com/office/word/2012/wordml" xmlns:w16cex="http://schemas.microsoft.com/office/word/2018/wordml/cex" xmlns:w16cid="http://schemas.microsoft.com/office/word/2016/wordml/cid" xmlns:w16="http://schemas.microsoft.com/office/word/2018/wordml" xmlns:w16du="http://schemas.microsoft.com/office/word/2023/wordml/word16du" xmlns:w16sdtdh="http://schemas.microsoft.com/office/word/2020/wordml/sdtdatahash" xmlns:w16sdtfl="http://schemas.microsoft.com/office/word/2024/wordml/sdtformatlock" xmlns:w16se="http://schemas.microsoft.com/office/word/2015/wordml/symex" xmlns:wpg="http://schemas.microsoft.com/office/word/2010/wordprocessingGroup" xmlns:wpi="http://schemas.microsoft.com/office/word/2010/wordprocessingInk" xmlns:wne="http://schemas.microsoft.com/office/word/2006/wordml" xmlns:wps="http://schemas.microsoft.com/office/word/2010/wordprocessingShape" mc:Ignorable="w14 w15 w16se w16cid w16 w16cex w16sdtdh w16sdtfl w16du wp14">
   <w:body>
     <w:p>
       <w:pPr>
@@ -101,7 +101,43 @@
           <w:szCs w:val="24"/>
           <w:lang w:eastAsia="en-GB"/>
         </w:rPr>
-        <w:t>and maintaining a watchlist, allowing the user to track viewing history, plan future watches, assign ratings, and write reviews.</w:t>
+        <w:t xml:space="preserve">and maintaining </w:t>
+      </w:r>
+      <w:r>
+        <w:rPr>
+          <w:rFonts w:ascii="Times New Roman" w:eastAsia="Times New Roman" w:hAnsi="Times New Roman" w:cs="Times New Roman"/>
+          <w:sz w:val="24"/>
+          <w:szCs w:val="24"/>
+          <w:lang w:eastAsia="en-GB"/>
+        </w:rPr>
+        <w:t>custom lists</w:t>
+      </w:r>
+      <w:r>
+        <w:rPr>
+          <w:rFonts w:ascii="Times New Roman" w:eastAsia="Times New Roman" w:hAnsi="Times New Roman" w:cs="Times New Roman"/>
+          <w:sz w:val="24"/>
+          <w:szCs w:val="24"/>
+          <w:lang w:eastAsia="en-GB"/>
+        </w:rPr>
+        <w:t>, allowing the user to track viewing history</w:t>
+      </w:r>
+      <w:r>
+        <w:rPr>
+          <w:rFonts w:ascii="Times New Roman" w:eastAsia="Times New Roman" w:hAnsi="Times New Roman" w:cs="Times New Roman"/>
+          <w:sz w:val="24"/>
+          <w:szCs w:val="24"/>
+          <w:lang w:eastAsia="en-GB"/>
+        </w:rPr>
+        <w:t xml:space="preserve">, group the movies, </w:t>
+      </w:r>
+      <w:r>
+        <w:rPr>
+          <w:rFonts w:ascii="Times New Roman" w:eastAsia="Times New Roman" w:hAnsi="Times New Roman" w:cs="Times New Roman"/>
+          <w:sz w:val="24"/>
+          <w:szCs w:val="24"/>
+          <w:lang w:eastAsia="en-GB"/>
+        </w:rPr>
+        <w:t>assign ratings, and write reviews.</w:t>
       </w:r>
     </w:p>
     <w:p>
@@ -315,7 +351,7 @@
     <w:p>
       <w:pPr>
         <w:numPr>
-          <w:ilvl w:val="0"/>
+          <w:ilvl w:val="1"/>
           <w:numId w:val="2"/>
         </w:numPr>
         <w:spacing w:before="100" w:beforeAutospacing="1" w:after="100" w:afterAutospacing="1" w:line="240" w:lineRule="auto"/>
@@ -335,7 +371,16 @@
           <w:szCs w:val="24"/>
           <w:lang w:eastAsia="en-GB"/>
         </w:rPr>
-        <w:t>The "Watchlist Item" (To Watch):</w:t>
+        <w:t>Movie Link:</w:t>
+      </w:r>
+      <w:r>
+        <w:rPr>
+          <w:rFonts w:ascii="Times New Roman" w:eastAsia="Times New Roman" w:hAnsi="Times New Roman" w:cs="Times New Roman"/>
+          <w:sz w:val="24"/>
+          <w:szCs w:val="24"/>
+          <w:lang w:eastAsia="en-GB"/>
+        </w:rPr>
+        <w:t xml:space="preserve"> URL field for media source (format TBD)</w:t>
       </w:r>
     </w:p>
     <w:p>
@@ -361,16 +406,147 @@
           <w:szCs w:val="24"/>
           <w:lang w:eastAsia="en-GB"/>
         </w:rPr>
-        <w:t>Movie Name:</w:t>
-      </w:r>
-      <w:r>
-        <w:rPr>
-          <w:rFonts w:ascii="Times New Roman" w:eastAsia="Times New Roman" w:hAnsi="Times New Roman" w:cs="Times New Roman"/>
-          <w:sz w:val="24"/>
-          <w:szCs w:val="24"/>
-          <w:lang w:eastAsia="en-GB"/>
-        </w:rPr>
-        <w:t xml:space="preserve"> Text (Mandatory)</w:t>
+        <w:t>Scene Captures:</w:t>
+      </w:r>
+      <w:r>
+        <w:rPr>
+          <w:rFonts w:ascii="Times New Roman" w:eastAsia="Times New Roman" w:hAnsi="Times New Roman" w:cs="Times New Roman"/>
+          <w:sz w:val="24"/>
+          <w:szCs w:val="24"/>
+          <w:lang w:eastAsia="en-GB"/>
+        </w:rPr>
+        <w:t xml:space="preserve"> A collection of images associated with the log, where each entry contains:</w:t>
+      </w:r>
+    </w:p>
+    <w:p>
+      <w:pPr>
+        <w:numPr>
+          <w:ilvl w:val="2"/>
+          <w:numId w:val="2"/>
+        </w:numPr>
+        <w:spacing w:before="100" w:beforeAutospacing="1" w:after="100" w:afterAutospacing="1" w:line="240" w:lineRule="auto"/>
+        <w:rPr>
+          <w:rFonts w:ascii="Times New Roman" w:eastAsia="Times New Roman" w:hAnsi="Times New Roman" w:cs="Times New Roman"/>
+          <w:sz w:val="24"/>
+          <w:szCs w:val="24"/>
+          <w:lang w:eastAsia="en-GB"/>
+        </w:rPr>
+      </w:pPr>
+      <w:r>
+        <w:rPr>
+          <w:rFonts w:ascii="Times New Roman" w:eastAsia="Times New Roman" w:hAnsi="Times New Roman" w:cs="Times New Roman"/>
+          <w:b/>
+          <w:bCs/>
+          <w:sz w:val="24"/>
+          <w:szCs w:val="24"/>
+          <w:lang w:eastAsia="en-GB"/>
+        </w:rPr>
+        <w:t>Image file:</w:t>
+      </w:r>
+      <w:r>
+        <w:rPr>
+          <w:rFonts w:ascii="Times New Roman" w:eastAsia="Times New Roman" w:hAnsi="Times New Roman" w:cs="Times New Roman"/>
+          <w:sz w:val="24"/>
+          <w:szCs w:val="24"/>
+          <w:lang w:eastAsia="en-GB"/>
+        </w:rPr>
+        <w:t xml:space="preserve"> .png format</w:t>
+      </w:r>
+    </w:p>
+    <w:p>
+      <w:pPr>
+        <w:numPr>
+          <w:ilvl w:val="2"/>
+          <w:numId w:val="2"/>
+        </w:numPr>
+        <w:spacing w:before="100" w:beforeAutospacing="1" w:after="100" w:afterAutospacing="1" w:line="240" w:lineRule="auto"/>
+        <w:rPr>
+          <w:rFonts w:ascii="Times New Roman" w:eastAsia="Times New Roman" w:hAnsi="Times New Roman" w:cs="Times New Roman"/>
+          <w:sz w:val="24"/>
+          <w:szCs w:val="24"/>
+          <w:lang w:eastAsia="en-GB"/>
+        </w:rPr>
+      </w:pPr>
+      <w:r>
+        <w:rPr>
+          <w:rFonts w:ascii="Times New Roman" w:eastAsia="Times New Roman" w:hAnsi="Times New Roman" w:cs="Times New Roman"/>
+          <w:b/>
+          <w:bCs/>
+          <w:sz w:val="24"/>
+          <w:szCs w:val="24"/>
+          <w:lang w:eastAsia="en-GB"/>
+        </w:rPr>
+        <w:t>Timestamp:</w:t>
+      </w:r>
+      <w:r>
+        <w:rPr>
+          <w:rFonts w:ascii="Times New Roman" w:eastAsia="Times New Roman" w:hAnsi="Times New Roman" w:cs="Times New Roman"/>
+          <w:sz w:val="24"/>
+          <w:szCs w:val="24"/>
+          <w:lang w:eastAsia="en-GB"/>
+        </w:rPr>
+        <w:t xml:space="preserve"> Timecode referencing the moment in the film</w:t>
+      </w:r>
+    </w:p>
+    <w:p>
+      <w:pPr>
+        <w:numPr>
+          <w:ilvl w:val="2"/>
+          <w:numId w:val="2"/>
+        </w:numPr>
+        <w:spacing w:before="100" w:beforeAutospacing="1" w:after="100" w:afterAutospacing="1" w:line="240" w:lineRule="auto"/>
+        <w:rPr>
+          <w:rFonts w:ascii="Times New Roman" w:eastAsia="Times New Roman" w:hAnsi="Times New Roman" w:cs="Times New Roman"/>
+          <w:sz w:val="24"/>
+          <w:szCs w:val="24"/>
+          <w:lang w:eastAsia="en-GB"/>
+        </w:rPr>
+      </w:pPr>
+      <w:r>
+        <w:rPr>
+          <w:rFonts w:ascii="Times New Roman" w:eastAsia="Times New Roman" w:hAnsi="Times New Roman" w:cs="Times New Roman"/>
+          <w:b/>
+          <w:bCs/>
+          <w:sz w:val="24"/>
+          <w:szCs w:val="24"/>
+          <w:lang w:eastAsia="en-GB"/>
+        </w:rPr>
+        <w:t>Caption:</w:t>
+      </w:r>
+      <w:r>
+        <w:rPr>
+          <w:rFonts w:ascii="Times New Roman" w:eastAsia="Times New Roman" w:hAnsi="Times New Roman" w:cs="Times New Roman"/>
+          <w:sz w:val="24"/>
+          <w:szCs w:val="24"/>
+          <w:lang w:eastAsia="en-GB"/>
+        </w:rPr>
+        <w:t xml:space="preserve"> Short text block</w:t>
+      </w:r>
+    </w:p>
+    <w:p>
+      <w:pPr>
+        <w:numPr>
+          <w:ilvl w:val="0"/>
+          <w:numId w:val="2"/>
+        </w:numPr>
+        <w:spacing w:before="100" w:beforeAutospacing="1" w:after="100" w:afterAutospacing="1" w:line="240" w:lineRule="auto"/>
+        <w:rPr>
+          <w:rFonts w:ascii="Times New Roman" w:eastAsia="Times New Roman" w:hAnsi="Times New Roman" w:cs="Times New Roman"/>
+          <w:sz w:val="24"/>
+          <w:szCs w:val="24"/>
+          <w:lang w:eastAsia="en-GB"/>
+        </w:rPr>
+      </w:pPr>
+      <w:r>
+        <w:rPr>
+          <w:rFonts w:ascii="Times New Roman" w:eastAsia="Times New Roman" w:hAnsi="Times New Roman" w:cs="Times New Roman"/>
+          <w:b/>
+          <w:bCs/>
+          <w:sz w:val="24"/>
+          <w:szCs w:val="24"/>
+          <w:lang w:eastAsia="en-GB"/>
+        </w:rPr>
+        <w:t>The "Custom List" (Personal Collection):</w:t>
       </w:r>
     </w:p>
     <w:p>
@@ -396,42 +572,19 @@
           <w:szCs w:val="24"/>
           <w:lang w:eastAsia="en-GB"/>
         </w:rPr>
-        <w:t>Action:</w:t>
-      </w:r>
-      <w:r>
-        <w:rPr>
-          <w:rFonts w:ascii="Times New Roman" w:eastAsia="Times New Roman" w:hAnsi="Times New Roman" w:cs="Times New Roman"/>
-          <w:sz w:val="24"/>
-          <w:szCs w:val="24"/>
-          <w:lang w:eastAsia="en-GB"/>
-        </w:rPr>
-        <w:t xml:space="preserve"> A "Log Movie" button that instantly transfers the title to a new "Movie Log" draft, prompting the user for the Watch Date.</w:t>
-      </w:r>
-    </w:p>
-    <w:p>
-      <w:pPr>
-        <w:numPr>
-          <w:ilvl w:val="0"/>
-          <w:numId w:val="2"/>
-        </w:numPr>
-        <w:spacing w:before="100" w:beforeAutospacing="1" w:after="100" w:afterAutospacing="1" w:line="240" w:lineRule="auto"/>
-        <w:rPr>
-          <w:rFonts w:ascii="Times New Roman" w:eastAsia="Times New Roman" w:hAnsi="Times New Roman" w:cs="Times New Roman"/>
-          <w:sz w:val="24"/>
-          <w:szCs w:val="24"/>
-          <w:lang w:eastAsia="en-GB"/>
-        </w:rPr>
-      </w:pPr>
-      <w:r>
-        <w:rPr>
-          <w:rFonts w:ascii="Times New Roman" w:eastAsia="Times New Roman" w:hAnsi="Times New Roman" w:cs="Times New Roman"/>
-          <w:b/>
-          <w:bCs/>
-          <w:sz w:val="24"/>
-          <w:szCs w:val="24"/>
-          <w:lang w:eastAsia="en-GB"/>
-        </w:rPr>
-        <w:t>The "Custom List" (Personal Collection):</w:t>
+        <w:t>List Name:</w:t>
+      </w:r>
+      <w:r>
+        <w:t xml:space="preserve"> </w:t>
+      </w:r>
+      <w:r>
+        <w:rPr>
+          <w:rFonts w:ascii="Times New Roman" w:eastAsia="Times New Roman" w:hAnsi="Times New Roman" w:cs="Times New Roman"/>
+          <w:sz w:val="24"/>
+          <w:szCs w:val="24"/>
+          <w:lang w:eastAsia="en-GB"/>
+        </w:rPr>
+        <w:t>Text (Mandatory)</w:t>
       </w:r>
     </w:p>
     <w:p>
@@ -457,7 +610,7 @@
           <w:szCs w:val="24"/>
           <w:lang w:eastAsia="en-GB"/>
         </w:rPr>
-        <w:t>List Name:</w:t>
+        <w:t>Description:</w:t>
       </w:r>
       <w:r>
         <w:t xml:space="preserve"> </w:t>
@@ -469,7 +622,7 @@
           <w:szCs w:val="24"/>
           <w:lang w:eastAsia="en-GB"/>
         </w:rPr>
-        <w:t>Text (Mandatory)</w:t>
+        <w:t>Short text block (Optional)</w:t>
       </w:r>
     </w:p>
     <w:p>
@@ -495,7 +648,7 @@
           <w:szCs w:val="24"/>
           <w:lang w:eastAsia="en-GB"/>
         </w:rPr>
-        <w:t>Description:</w:t>
+        <w:t>Movies:</w:t>
       </w:r>
       <w:r>
         <w:t xml:space="preserve"> </w:t>
@@ -507,15 +660,20 @@
           <w:szCs w:val="24"/>
           <w:lang w:eastAsia="en-GB"/>
         </w:rPr>
-        <w:t>Short text block (Optional)</w:t>
-      </w:r>
-    </w:p>
-    <w:p>
-      <w:pPr>
-        <w:numPr>
-          <w:ilvl w:val="1"/>
-          <w:numId w:val="2"/>
-        </w:numPr>
+        <w:t>A collection of referenced movie titles</w:t>
+      </w:r>
+      <w:r>
+        <w:rPr>
+          <w:rFonts w:ascii="Times New Roman" w:eastAsia="Times New Roman" w:hAnsi="Times New Roman" w:cs="Times New Roman"/>
+          <w:sz w:val="24"/>
+          <w:szCs w:val="24"/>
+          <w:lang w:eastAsia="en-GB"/>
+        </w:rPr>
+        <w:t>.</w:t>
+      </w:r>
+    </w:p>
+    <w:p>
+      <w:pPr>
         <w:spacing w:before="100" w:beforeAutospacing="1" w:after="100" w:afterAutospacing="1" w:line="240" w:lineRule="auto"/>
         <w:rPr>
           <w:rFonts w:ascii="Times New Roman" w:eastAsia="Times New Roman" w:hAnsi="Times New Roman" w:cs="Times New Roman"/>
@@ -533,40 +691,17 @@
           <w:szCs w:val="24"/>
           <w:lang w:eastAsia="en-GB"/>
         </w:rPr>
-        <w:t>Movies:</w:t>
-      </w:r>
-      <w:r>
+        <w:t>3.</w:t>
+      </w:r>
+      <w:r>
+        <w:rPr>
+          <w:rFonts w:ascii="Times New Roman" w:eastAsia="Times New Roman" w:hAnsi="Times New Roman" w:cs="Times New Roman"/>
+          <w:sz w:val="24"/>
+          <w:szCs w:val="24"/>
+          <w:lang w:eastAsia="en-GB"/>
+        </w:rPr>
         <w:t xml:space="preserve"> </w:t>
       </w:r>
-      <w:r>
-        <w:rPr>
-          <w:rFonts w:ascii="Times New Roman" w:eastAsia="Times New Roman" w:hAnsi="Times New Roman" w:cs="Times New Roman"/>
-          <w:sz w:val="24"/>
-          <w:szCs w:val="24"/>
-          <w:lang w:eastAsia="en-GB"/>
-        </w:rPr>
-        <w:t>A collection of referenced movie titles</w:t>
-      </w:r>
-      <w:r>
-        <w:rPr>
-          <w:rFonts w:ascii="Times New Roman" w:eastAsia="Times New Roman" w:hAnsi="Times New Roman" w:cs="Times New Roman"/>
-          <w:sz w:val="24"/>
-          <w:szCs w:val="24"/>
-          <w:lang w:eastAsia="en-GB"/>
-        </w:rPr>
-        <w:t>.</w:t>
-      </w:r>
-    </w:p>
-    <w:p>
-      <w:pPr>
-        <w:spacing w:before="100" w:beforeAutospacing="1" w:after="100" w:afterAutospacing="1" w:line="240" w:lineRule="auto"/>
-        <w:rPr>
-          <w:rFonts w:ascii="Times New Roman" w:eastAsia="Times New Roman" w:hAnsi="Times New Roman" w:cs="Times New Roman"/>
-          <w:sz w:val="24"/>
-          <w:szCs w:val="24"/>
-          <w:lang w:eastAsia="en-GB"/>
-        </w:rPr>
-      </w:pPr>
       <w:r>
         <w:rPr>
           <w:rFonts w:ascii="Times New Roman" w:eastAsia="Times New Roman" w:hAnsi="Times New Roman" w:cs="Times New Roman"/>
@@ -576,43 +711,18 @@
           <w:szCs w:val="24"/>
           <w:lang w:eastAsia="en-GB"/>
         </w:rPr>
-        <w:t>3.</w:t>
-      </w:r>
-      <w:r>
-        <w:rPr>
-          <w:rFonts w:ascii="Times New Roman" w:eastAsia="Times New Roman" w:hAnsi="Times New Roman" w:cs="Times New Roman"/>
-          <w:sz w:val="24"/>
-          <w:szCs w:val="24"/>
-          <w:lang w:eastAsia="en-GB"/>
-        </w:rPr>
-        <w:t xml:space="preserve"> </w:t>
-      </w:r>
-      <w:r>
-        <w:rPr>
-          <w:rFonts w:ascii="Times New Roman" w:eastAsia="Times New Roman" w:hAnsi="Times New Roman" w:cs="Times New Roman"/>
-          <w:b/>
-          <w:bCs/>
-          <w:sz w:val="24"/>
-          <w:szCs w:val="24"/>
-          <w:lang w:eastAsia="en-GB"/>
-        </w:rPr>
         <w:t>Features</w:t>
       </w:r>
     </w:p>
     <w:p>
       <w:pPr>
         <w:pStyle w:val="NormalWeb"/>
-        <w:ind w:left="720"/>
-      </w:pPr>
-      <w:r>
-        <w:rPr>
-          <w:rFonts w:hAnsi="Symbol"/>
-        </w:rPr>
-        <w:t></w:t>
-      </w:r>
-      <w:r>
-        <w:t xml:space="preserve"> </w:t>
-      </w:r>
+        <w:numPr>
+          <w:ilvl w:val="0"/>
+          <w:numId w:val="7"/>
+        </w:numPr>
+        <w:spacing w:after="240" w:afterAutospacing="0"/>
+      </w:pPr>
       <w:r>
         <w:rPr>
           <w:rStyle w:val="citation-257"/>
@@ -646,23 +756,29 @@
         <w:t>for login and register views</w:t>
       </w:r>
       <w:r>
-        <w:t>. All logs and watchlists are strictly private to the authenticated user.</w:t>
+        <w:t xml:space="preserve">. All logs and </w:t>
+      </w:r>
+      <w:proofErr w:type="gramStart"/>
+      <w:r>
+        <w:t>custom-lists</w:t>
+      </w:r>
+      <w:proofErr w:type="gramEnd"/>
+      <w:r>
+        <w:t xml:space="preserve"> </w:t>
+      </w:r>
+      <w:r>
+        <w:t>are strictly private to the authenticated user.</w:t>
       </w:r>
     </w:p>
     <w:p>
       <w:pPr>
         <w:pStyle w:val="NormalWeb"/>
-        <w:ind w:left="720"/>
-      </w:pPr>
-      <w:r>
-        <w:rPr>
-          <w:rFonts w:hAnsi="Symbol"/>
-        </w:rPr>
-        <w:t></w:t>
-      </w:r>
-      <w:r>
-        <w:t xml:space="preserve">  </w:t>
-      </w:r>
+        <w:numPr>
+          <w:ilvl w:val="0"/>
+          <w:numId w:val="7"/>
+        </w:numPr>
+        <w:spacing w:after="240" w:afterAutospacing="0"/>
+      </w:pPr>
       <w:r>
         <w:rPr>
           <w:rStyle w:val="citation-257"/>
@@ -684,17 +800,12 @@
     <w:p>
       <w:pPr>
         <w:pStyle w:val="NormalWeb"/>
-        <w:ind w:left="720"/>
-      </w:pPr>
-      <w:r>
-        <w:rPr>
-          <w:rFonts w:hAnsi="Symbol"/>
-        </w:rPr>
-        <w:t></w:t>
-      </w:r>
-      <w:r>
-        <w:t xml:space="preserve">  </w:t>
-      </w:r>
+        <w:numPr>
+          <w:ilvl w:val="0"/>
+          <w:numId w:val="7"/>
+        </w:numPr>
+        <w:spacing w:after="240" w:afterAutospacing="0"/>
+      </w:pPr>
       <w:r>
         <w:rPr>
           <w:rStyle w:val="citation-256"/>
@@ -726,17 +837,26 @@
       <w:pPr>
         <w:pStyle w:val="NormalWeb"/>
         <w:numPr>
-          <w:ilvl w:val="0"/>
-          <w:numId w:val="4"/>
+          <w:ilvl w:val="1"/>
+          <w:numId w:val="7"/>
         </w:numPr>
-        <w:tabs>
-          <w:tab w:val="clear" w:pos="720"/>
-          <w:tab w:val="num" w:pos="1440"/>
-        </w:tabs>
-        <w:ind w:left="1440"/>
+        <w:spacing w:after="240" w:afterAutospacing="0"/>
       </w:pPr>
       <w:r>
         <w:t>The Log History table will display the Movie Name and Watch Date, with sorting capabilities.</w:t>
+      </w:r>
+    </w:p>
+    <w:p>
+      <w:pPr>
+        <w:pStyle w:val="NormalWeb"/>
+        <w:numPr>
+          <w:ilvl w:val="1"/>
+          <w:numId w:val="7"/>
+        </w:numPr>
+        <w:spacing w:after="240" w:afterAutospacing="0"/>
+      </w:pPr>
+      <w:r>
+        <w:t>The Custom Lists table will display the List Name and Description.</w:t>
       </w:r>
     </w:p>
     <w:p>
@@ -744,49 +864,105 @@
         <w:pStyle w:val="NormalWeb"/>
         <w:numPr>
           <w:ilvl w:val="0"/>
-          <w:numId w:val="4"/>
+          <w:numId w:val="7"/>
         </w:numPr>
-        <w:tabs>
-          <w:tab w:val="clear" w:pos="720"/>
-          <w:tab w:val="num" w:pos="1440"/>
-        </w:tabs>
-        <w:ind w:left="1440"/>
-      </w:pPr>
-      <w:r>
-        <w:t>The Watchlist table will display the Movie Name and an action button to quickly log the film.</w:t>
-      </w:r>
+        <w:spacing w:after="240" w:afterAutospacing="0"/>
+      </w:pPr>
+      <w:r>
+        <w:rPr>
+          <w:rFonts w:hAnsi="Symbol"/>
+          <w:b/>
+          <w:bCs/>
+        </w:rPr>
+        <w:t>Media Player &amp; Frame Capture:</w:t>
+      </w:r>
+      <w:r>
+        <w:rPr>
+          <w:rFonts w:hAnsi="Symbol"/>
+        </w:rPr>
+        <w:t xml:space="preserve"> Within the detail perspective of a logged movie, if a Movie Link is provided, a built-in media player will play the video directly.</w:t>
+      </w:r>
+    </w:p>
+    <w:p>
+      <w:pPr>
+        <w:pStyle w:val="NormalWeb"/>
+        <w:numPr>
+          <w:ilvl w:val="1"/>
+          <w:numId w:val="7"/>
+        </w:numPr>
+        <w:spacing w:after="240" w:afterAutospacing="0"/>
+        <w:rPr>
+          <w:rFonts w:hAnsi="Symbol"/>
+        </w:rPr>
+      </w:pPr>
+      <w:r>
+        <w:rPr>
+          <w:rFonts w:hAnsi="Symbol"/>
+          <w:b/>
+          <w:bCs/>
+        </w:rPr>
+        <w:t>Auto-Capture:</w:t>
+      </w:r>
+      <w:r>
+        <w:rPr>
+          <w:rFonts w:hAnsi="Symbol"/>
+        </w:rPr>
+        <w:t xml:space="preserve"> A "Save Image" button will be available to capture the currently displayed frame from the media player. This action will </w:t>
+      </w:r>
+      <w:r>
+        <w:rPr>
+          <w:rFonts w:hAnsi="Symbol"/>
+        </w:rPr>
+        <w:lastRenderedPageBreak/>
+        <w:t>automatically save the frame to the movie's Scene Captures list, log the exact video timestamp, and prompt the user to add a short caption.</w:t>
+      </w:r>
+    </w:p>
+    <w:p>
+      <w:pPr>
+        <w:pStyle w:val="NormalWeb"/>
+        <w:numPr>
+          <w:ilvl w:val="1"/>
+          <w:numId w:val="7"/>
+        </w:numPr>
+        <w:spacing w:after="240" w:afterAutospacing="0"/>
+        <w:rPr>
+          <w:rFonts w:hAnsi="Symbol"/>
+        </w:rPr>
+      </w:pPr>
+      <w:r>
+        <w:rPr>
+          <w:rFonts w:hAnsi="Symbol"/>
+          <w:b/>
+          <w:bCs/>
+        </w:rPr>
+        <w:t>Manual Upload:</w:t>
+      </w:r>
+      <w:r>
+        <w:rPr>
+          <w:rFonts w:hAnsi="Symbol"/>
+        </w:rPr>
+        <w:t xml:space="preserve"> A separate "Upload Frame" button will also be provided. This allows users to manually upload a local .png file to the Scene Captures list and manually input the corresponding timestamp and caption.</w:t>
+      </w:r>
+    </w:p>
+    <w:p>
+      <w:pPr>
+        <w:pStyle w:val="NormalWeb"/>
+        <w:spacing w:after="240" w:afterAutospacing="0"/>
+        <w:ind w:left="720"/>
+        <w:rPr>
+          <w:rFonts w:hAnsi="Symbol"/>
+        </w:rPr>
+      </w:pPr>
     </w:p>
     <w:p>
       <w:pPr>
         <w:pStyle w:val="NormalWeb"/>
         <w:numPr>
           <w:ilvl w:val="0"/>
-          <w:numId w:val="4"/>
+          <w:numId w:val="7"/>
         </w:numPr>
-        <w:tabs>
-          <w:tab w:val="clear" w:pos="720"/>
-          <w:tab w:val="num" w:pos="1440"/>
-        </w:tabs>
-        <w:ind w:left="1440"/>
-      </w:pPr>
-      <w:r>
-        <w:t>The Custom Lists table will display the List Name and Description.</w:t>
-      </w:r>
-    </w:p>
-    <w:p>
-      <w:pPr>
-        <w:pStyle w:val="NormalWeb"/>
-        <w:ind w:left="720"/>
-      </w:pPr>
-      <w:r>
-        <w:rPr>
-          <w:rFonts w:hAnsi="Symbol"/>
-        </w:rPr>
-        <w:t></w:t>
-      </w:r>
-      <w:r>
-        <w:t xml:space="preserve"> </w:t>
-      </w:r>
+        <w:spacing w:after="240" w:afterAutospacing="0"/>
+      </w:pPr>
       <w:r>
         <w:rPr>
           <w:rStyle w:val="citation-257"/>
@@ -816,18 +992,12 @@
     <w:p>
       <w:pPr>
         <w:pStyle w:val="NormalWeb"/>
-        <w:ind w:left="720"/>
-      </w:pPr>
-      <w:r>
-        <w:rPr>
-          <w:rFonts w:hAnsi="Symbol"/>
-        </w:rPr>
-        <w:lastRenderedPageBreak/>
-        <w:t></w:t>
-      </w:r>
-      <w:r>
-        <w:t xml:space="preserve">  </w:t>
-      </w:r>
+        <w:numPr>
+          <w:ilvl w:val="0"/>
+          <w:numId w:val="7"/>
+        </w:numPr>
+        <w:spacing w:after="240" w:afterAutospacing="0"/>
+      </w:pPr>
       <w:r>
         <w:rPr>
           <w:rStyle w:val="citation-253"/>
@@ -867,7 +1037,7 @@
 </file>
 
 <file path=word/numbering.xml><?xml version="1.0" encoding="utf-8"?>
-<w:numbering xmlns:wpc="http://schemas.microsoft.com/office/word/2010/wordprocessingCanvas" xmlns:cx="http://schemas.microsoft.com/office/drawing/2014/chartex" xmlns:cx1="http://schemas.microsoft.com/office/drawing/2015/9/8/chartex" xmlns:cx2="http://schemas.microsoft.com/office/drawing/2015/10/21/chartex" xmlns:cx3="http://schemas.microsoft.com/office/drawing/2016/5/9/chartex" xmlns:cx4="http://schemas.microsoft.com/office/drawing/2016/5/10/chartex" xmlns:cx5="http://schemas.microsoft.com/office/drawing/2016/5/11/chartex" xmlns:cx6="http://schemas.microsoft.com/office/drawing/2016/5/12/chartex" xmlns:cx7="http://schemas.microsoft.com/office/drawing/2016/5/13/chartex" xmlns:cx8="http://schemas.microsoft.com/office/drawing/2016/5/14/chartex" xmlns:mc="http://schemas.openxmlformats.org/markup-compatibility/2006" xmlns:aink="http://schemas.microsoft.com/office/drawing/2016/ink" xmlns:am3d="http://schemas.microsoft.com/office/drawing/2017/model3d" xmlns:o="urn:schemas-microsoft-com:office:office" xmlns:r="http://schemas.openxmlformats.org/officeDocument/2006/relationships" xmlns:m="http://schemas.openxmlformats.org/officeDocument/2006/math" xmlns:v="urn:schemas-microsoft-com:vml" xmlns:wp14="http://schemas.microsoft.com/office/word/2010/wordprocessingDrawing" xmlns:wp="http://schemas.openxmlformats.org/drawingml/2006/wordprocessingDrawing" xmlns:w10="urn:schemas-microsoft-com:office:word" xmlns:w="http://schemas.openxmlformats.org/wordprocessingml/2006/main" xmlns:w14="http://schemas.microsoft.com/office/word/2010/wordml" xmlns:w15="http://schemas.microsoft.com/office/word/2012/wordml" xmlns:w16cex="http://schemas.microsoft.com/office/word/2018/wordml/cex" xmlns:w16cid="http://schemas.microsoft.com/office/word/2016/wordml/cid" xmlns:w16="http://schemas.microsoft.com/office/word/2018/wordml" xmlns:w16sdtdh="http://schemas.microsoft.com/office/word/2020/wordml/sdtdatahash" xmlns:w16se="http://schemas.microsoft.com/office/word/2015/wordml/symex" xmlns:wpg="http://schemas.microsoft.com/office/word/2010/wordprocessingGroup" xmlns:wpi="http://schemas.microsoft.com/office/word/2010/wordprocessingInk" xmlns:wne="http://schemas.microsoft.com/office/word/2006/wordml" xmlns:wps="http://schemas.microsoft.com/office/word/2010/wordprocessingShape" mc:Ignorable="w14 w15 w16se w16cid w16 w16cex w16sdtdh wp14">
+<w:numbering xmlns:wpc="http://schemas.microsoft.com/office/word/2010/wordprocessingCanvas" xmlns:cx="http://schemas.microsoft.com/office/drawing/2014/chartex" xmlns:cx1="http://schemas.microsoft.com/office/drawing/2015/9/8/chartex" xmlns:cx2="http://schemas.microsoft.com/office/drawing/2015/10/21/chartex" xmlns:cx3="http://schemas.microsoft.com/office/drawing/2016/5/9/chartex" xmlns:cx4="http://schemas.microsoft.com/office/drawing/2016/5/10/chartex" xmlns:cx5="http://schemas.microsoft.com/office/drawing/2016/5/11/chartex" xmlns:cx6="http://schemas.microsoft.com/office/drawing/2016/5/12/chartex" xmlns:cx7="http://schemas.microsoft.com/office/drawing/2016/5/13/chartex" xmlns:cx8="http://schemas.microsoft.com/office/drawing/2016/5/14/chartex" xmlns:mc="http://schemas.openxmlformats.org/markup-compatibility/2006" xmlns:aink="http://schemas.microsoft.com/office/drawing/2016/ink" xmlns:am3d="http://schemas.microsoft.com/office/drawing/2017/model3d" xmlns:o="urn:schemas-microsoft-com:office:office" xmlns:oel="http://schemas.microsoft.com/office/2019/extlst" xmlns:r="http://schemas.openxmlformats.org/officeDocument/2006/relationships" xmlns:m="http://schemas.openxmlformats.org/officeDocument/2006/math" xmlns:v="urn:schemas-microsoft-com:vml" xmlns:wp14="http://schemas.microsoft.com/office/word/2010/wordprocessingDrawing" xmlns:wp="http://schemas.openxmlformats.org/drawingml/2006/wordprocessingDrawing" xmlns:w10="urn:schemas-microsoft-com:office:word" xmlns:w="http://schemas.openxmlformats.org/wordprocessingml/2006/main" xmlns:w14="http://schemas.microsoft.com/office/word/2010/wordml" xmlns:w15="http://schemas.microsoft.com/office/word/2012/wordml" xmlns:w16cex="http://schemas.microsoft.com/office/word/2018/wordml/cex" xmlns:w16cid="http://schemas.microsoft.com/office/word/2016/wordml/cid" xmlns:w16="http://schemas.microsoft.com/office/word/2018/wordml" xmlns:w16du="http://schemas.microsoft.com/office/word/2023/wordml/word16du" xmlns:w16sdtdh="http://schemas.microsoft.com/office/word/2020/wordml/sdtdatahash" xmlns:w16sdtfl="http://schemas.microsoft.com/office/word/2024/wordml/sdtformatlock" xmlns:w16se="http://schemas.microsoft.com/office/word/2015/wordml/symex" xmlns:wpg="http://schemas.microsoft.com/office/word/2010/wordprocessingGroup" xmlns:wpi="http://schemas.microsoft.com/office/word/2010/wordprocessingInk" xmlns:wne="http://schemas.microsoft.com/office/word/2006/wordml" xmlns:wps="http://schemas.microsoft.com/office/word/2010/wordprocessingShape" mc:Ignorable="w14 w15 w16se w16cid w16 w16cex w16sdtdh w16sdtfl w16du wp14">
   <w:abstractNum w:abstractNumId="0" w15:restartNumberingAfterBreak="0">
     <w:nsid w:val="0B7B1B0F"/>
     <w:multiLevelType w:val="multilevel"/>
@@ -1018,6 +1188,155 @@
     </w:lvl>
   </w:abstractNum>
   <w:abstractNum w:abstractNumId="1" w15:restartNumberingAfterBreak="0">
+    <w:nsid w:val="2AC633AC"/>
+    <w:multiLevelType w:val="multilevel"/>
+    <w:tmpl w:val="FE300938"/>
+    <w:lvl w:ilvl="0">
+      <w:start w:val="1"/>
+      <w:numFmt w:val="bullet"/>
+      <w:lvlText w:val=""/>
+      <w:lvlJc w:val="left"/>
+      <w:pPr>
+        <w:tabs>
+          <w:tab w:val="num" w:pos="720"/>
+        </w:tabs>
+        <w:ind w:left="720" w:hanging="360"/>
+      </w:pPr>
+      <w:rPr>
+        <w:rFonts w:ascii="Symbol" w:hAnsi="Symbol" w:hint="default"/>
+        <w:sz w:val="20"/>
+      </w:rPr>
+    </w:lvl>
+    <w:lvl w:ilvl="1" w:tentative="1">
+      <w:start w:val="1"/>
+      <w:numFmt w:val="bullet"/>
+      <w:lvlText w:val="o"/>
+      <w:lvlJc w:val="left"/>
+      <w:pPr>
+        <w:tabs>
+          <w:tab w:val="num" w:pos="1440"/>
+        </w:tabs>
+        <w:ind w:left="1440" w:hanging="360"/>
+      </w:pPr>
+      <w:rPr>
+        <w:rFonts w:ascii="Courier New" w:hAnsi="Courier New" w:hint="default"/>
+        <w:sz w:val="20"/>
+      </w:rPr>
+    </w:lvl>
+    <w:lvl w:ilvl="2" w:tentative="1">
+      <w:start w:val="1"/>
+      <w:numFmt w:val="bullet"/>
+      <w:lvlText w:val=""/>
+      <w:lvlJc w:val="left"/>
+      <w:pPr>
+        <w:tabs>
+          <w:tab w:val="num" w:pos="2160"/>
+        </w:tabs>
+        <w:ind w:left="2160" w:hanging="360"/>
+      </w:pPr>
+      <w:rPr>
+        <w:rFonts w:ascii="Wingdings" w:hAnsi="Wingdings" w:hint="default"/>
+        <w:sz w:val="20"/>
+      </w:rPr>
+    </w:lvl>
+    <w:lvl w:ilvl="3" w:tentative="1">
+      <w:start w:val="1"/>
+      <w:numFmt w:val="bullet"/>
+      <w:lvlText w:val=""/>
+      <w:lvlJc w:val="left"/>
+      <w:pPr>
+        <w:tabs>
+          <w:tab w:val="num" w:pos="2880"/>
+        </w:tabs>
+        <w:ind w:left="2880" w:hanging="360"/>
+      </w:pPr>
+      <w:rPr>
+        <w:rFonts w:ascii="Wingdings" w:hAnsi="Wingdings" w:hint="default"/>
+        <w:sz w:val="20"/>
+      </w:rPr>
+    </w:lvl>
+    <w:lvl w:ilvl="4" w:tentative="1">
+      <w:start w:val="1"/>
+      <w:numFmt w:val="bullet"/>
+      <w:lvlText w:val=""/>
+      <w:lvlJc w:val="left"/>
+      <w:pPr>
+        <w:tabs>
+          <w:tab w:val="num" w:pos="3600"/>
+        </w:tabs>
+        <w:ind w:left="3600" w:hanging="360"/>
+      </w:pPr>
+      <w:rPr>
+        <w:rFonts w:ascii="Wingdings" w:hAnsi="Wingdings" w:hint="default"/>
+        <w:sz w:val="20"/>
+      </w:rPr>
+    </w:lvl>
+    <w:lvl w:ilvl="5" w:tentative="1">
+      <w:start w:val="1"/>
+      <w:numFmt w:val="bullet"/>
+      <w:lvlText w:val=""/>
+      <w:lvlJc w:val="left"/>
+      <w:pPr>
+        <w:tabs>
+          <w:tab w:val="num" w:pos="4320"/>
+        </w:tabs>
+        <w:ind w:left="4320" w:hanging="360"/>
+      </w:pPr>
+      <w:rPr>
+        <w:rFonts w:ascii="Wingdings" w:hAnsi="Wingdings" w:hint="default"/>
+        <w:sz w:val="20"/>
+      </w:rPr>
+    </w:lvl>
+    <w:lvl w:ilvl="6" w:tentative="1">
+      <w:start w:val="1"/>
+      <w:numFmt w:val="bullet"/>
+      <w:lvlText w:val=""/>
+      <w:lvlJc w:val="left"/>
+      <w:pPr>
+        <w:tabs>
+          <w:tab w:val="num" w:pos="5040"/>
+        </w:tabs>
+        <w:ind w:left="5040" w:hanging="360"/>
+      </w:pPr>
+      <w:rPr>
+        <w:rFonts w:ascii="Wingdings" w:hAnsi="Wingdings" w:hint="default"/>
+        <w:sz w:val="20"/>
+      </w:rPr>
+    </w:lvl>
+    <w:lvl w:ilvl="7" w:tentative="1">
+      <w:start w:val="1"/>
+      <w:numFmt w:val="bullet"/>
+      <w:lvlText w:val=""/>
+      <w:lvlJc w:val="left"/>
+      <w:pPr>
+        <w:tabs>
+          <w:tab w:val="num" w:pos="5760"/>
+        </w:tabs>
+        <w:ind w:left="5760" w:hanging="360"/>
+      </w:pPr>
+      <w:rPr>
+        <w:rFonts w:ascii="Wingdings" w:hAnsi="Wingdings" w:hint="default"/>
+        <w:sz w:val="20"/>
+      </w:rPr>
+    </w:lvl>
+    <w:lvl w:ilvl="8" w:tentative="1">
+      <w:start w:val="1"/>
+      <w:numFmt w:val="bullet"/>
+      <w:lvlText w:val=""/>
+      <w:lvlJc w:val="left"/>
+      <w:pPr>
+        <w:tabs>
+          <w:tab w:val="num" w:pos="6480"/>
+        </w:tabs>
+        <w:ind w:left="6480" w:hanging="360"/>
+      </w:pPr>
+      <w:rPr>
+        <w:rFonts w:ascii="Wingdings" w:hAnsi="Wingdings" w:hint="default"/>
+        <w:sz w:val="20"/>
+      </w:rPr>
+    </w:lvl>
+  </w:abstractNum>
+  <w:abstractNum w:abstractNumId="2" w15:restartNumberingAfterBreak="0">
     <w:nsid w:val="41465F0E"/>
     <w:multiLevelType w:val="multilevel"/>
     <w:tmpl w:val="BC9EA8E2"/>
@@ -1166,7 +1485,233 @@
       </w:rPr>
     </w:lvl>
   </w:abstractNum>
-  <w:abstractNum w:abstractNumId="2" w15:restartNumberingAfterBreak="0">
+  <w:abstractNum w:abstractNumId="3" w15:restartNumberingAfterBreak="0">
+    <w:nsid w:val="49CF5038"/>
+    <w:multiLevelType w:val="hybridMultilevel"/>
+    <w:tmpl w:val="84FA09AE"/>
+    <w:lvl w:ilvl="0" w:tplc="08090001">
+      <w:start w:val="1"/>
+      <w:numFmt w:val="bullet"/>
+      <w:lvlText w:val=""/>
+      <w:lvlJc w:val="left"/>
+      <w:pPr>
+        <w:ind w:left="720" w:hanging="360"/>
+      </w:pPr>
+      <w:rPr>
+        <w:rFonts w:ascii="Symbol" w:hAnsi="Symbol" w:hint="default"/>
+      </w:rPr>
+    </w:lvl>
+    <w:lvl w:ilvl="1" w:tplc="08090003" w:tentative="1">
+      <w:start w:val="1"/>
+      <w:numFmt w:val="bullet"/>
+      <w:lvlText w:val="o"/>
+      <w:lvlJc w:val="left"/>
+      <w:pPr>
+        <w:ind w:left="1440" w:hanging="360"/>
+      </w:pPr>
+      <w:rPr>
+        <w:rFonts w:ascii="Courier New" w:hAnsi="Courier New" w:cs="Courier New" w:hint="default"/>
+      </w:rPr>
+    </w:lvl>
+    <w:lvl w:ilvl="2" w:tplc="08090005" w:tentative="1">
+      <w:start w:val="1"/>
+      <w:numFmt w:val="bullet"/>
+      <w:lvlText w:val=""/>
+      <w:lvlJc w:val="left"/>
+      <w:pPr>
+        <w:ind w:left="2160" w:hanging="360"/>
+      </w:pPr>
+      <w:rPr>
+        <w:rFonts w:ascii="Wingdings" w:hAnsi="Wingdings" w:hint="default"/>
+      </w:rPr>
+    </w:lvl>
+    <w:lvl w:ilvl="3" w:tplc="08090001" w:tentative="1">
+      <w:start w:val="1"/>
+      <w:numFmt w:val="bullet"/>
+      <w:lvlText w:val=""/>
+      <w:lvlJc w:val="left"/>
+      <w:pPr>
+        <w:ind w:left="2880" w:hanging="360"/>
+      </w:pPr>
+      <w:rPr>
+        <w:rFonts w:ascii="Symbol" w:hAnsi="Symbol" w:hint="default"/>
+      </w:rPr>
+    </w:lvl>
+    <w:lvl w:ilvl="4" w:tplc="08090003" w:tentative="1">
+      <w:start w:val="1"/>
+      <w:numFmt w:val="bullet"/>
+      <w:lvlText w:val="o"/>
+      <w:lvlJc w:val="left"/>
+      <w:pPr>
+        <w:ind w:left="3600" w:hanging="360"/>
+      </w:pPr>
+      <w:rPr>
+        <w:rFonts w:ascii="Courier New" w:hAnsi="Courier New" w:cs="Courier New" w:hint="default"/>
+      </w:rPr>
+    </w:lvl>
+    <w:lvl w:ilvl="5" w:tplc="08090005" w:tentative="1">
+      <w:start w:val="1"/>
+      <w:numFmt w:val="bullet"/>
+      <w:lvlText w:val=""/>
+      <w:lvlJc w:val="left"/>
+      <w:pPr>
+        <w:ind w:left="4320" w:hanging="360"/>
+      </w:pPr>
+      <w:rPr>
+        <w:rFonts w:ascii="Wingdings" w:hAnsi="Wingdings" w:hint="default"/>
+      </w:rPr>
+    </w:lvl>
+    <w:lvl w:ilvl="6" w:tplc="08090001" w:tentative="1">
+      <w:start w:val="1"/>
+      <w:numFmt w:val="bullet"/>
+      <w:lvlText w:val=""/>
+      <w:lvlJc w:val="left"/>
+      <w:pPr>
+        <w:ind w:left="5040" w:hanging="360"/>
+      </w:pPr>
+      <w:rPr>
+        <w:rFonts w:ascii="Symbol" w:hAnsi="Symbol" w:hint="default"/>
+      </w:rPr>
+    </w:lvl>
+    <w:lvl w:ilvl="7" w:tplc="08090003" w:tentative="1">
+      <w:start w:val="1"/>
+      <w:numFmt w:val="bullet"/>
+      <w:lvlText w:val="o"/>
+      <w:lvlJc w:val="left"/>
+      <w:pPr>
+        <w:ind w:left="5760" w:hanging="360"/>
+      </w:pPr>
+      <w:rPr>
+        <w:rFonts w:ascii="Courier New" w:hAnsi="Courier New" w:cs="Courier New" w:hint="default"/>
+      </w:rPr>
+    </w:lvl>
+    <w:lvl w:ilvl="8" w:tplc="08090005" w:tentative="1">
+      <w:start w:val="1"/>
+      <w:numFmt w:val="bullet"/>
+      <w:lvlText w:val=""/>
+      <w:lvlJc w:val="left"/>
+      <w:pPr>
+        <w:ind w:left="6480" w:hanging="360"/>
+      </w:pPr>
+      <w:rPr>
+        <w:rFonts w:ascii="Wingdings" w:hAnsi="Wingdings" w:hint="default"/>
+      </w:rPr>
+    </w:lvl>
+  </w:abstractNum>
+  <w:abstractNum w:abstractNumId="4" w15:restartNumberingAfterBreak="0">
+    <w:nsid w:val="5DD2058B"/>
+    <w:multiLevelType w:val="hybridMultilevel"/>
+    <w:tmpl w:val="AD76361E"/>
+    <w:lvl w:ilvl="0" w:tplc="08090003">
+      <w:start w:val="1"/>
+      <w:numFmt w:val="bullet"/>
+      <w:lvlText w:val="o"/>
+      <w:lvlJc w:val="left"/>
+      <w:pPr>
+        <w:ind w:left="720" w:hanging="360"/>
+      </w:pPr>
+      <w:rPr>
+        <w:rFonts w:ascii="Courier New" w:hAnsi="Courier New" w:cs="Courier New" w:hint="default"/>
+      </w:rPr>
+    </w:lvl>
+    <w:lvl w:ilvl="1" w:tplc="08090003">
+      <w:start w:val="1"/>
+      <w:numFmt w:val="bullet"/>
+      <w:lvlText w:val="o"/>
+      <w:lvlJc w:val="left"/>
+      <w:pPr>
+        <w:ind w:left="1440" w:hanging="360"/>
+      </w:pPr>
+      <w:rPr>
+        <w:rFonts w:ascii="Courier New" w:hAnsi="Courier New" w:cs="Courier New" w:hint="default"/>
+      </w:rPr>
+    </w:lvl>
+    <w:lvl w:ilvl="2" w:tplc="08090005" w:tentative="1">
+      <w:start w:val="1"/>
+      <w:numFmt w:val="bullet"/>
+      <w:lvlText w:val=""/>
+      <w:lvlJc w:val="left"/>
+      <w:pPr>
+        <w:ind w:left="2160" w:hanging="360"/>
+      </w:pPr>
+      <w:rPr>
+        <w:rFonts w:ascii="Wingdings" w:hAnsi="Wingdings" w:hint="default"/>
+      </w:rPr>
+    </w:lvl>
+    <w:lvl w:ilvl="3" w:tplc="08090001" w:tentative="1">
+      <w:start w:val="1"/>
+      <w:numFmt w:val="bullet"/>
+      <w:lvlText w:val=""/>
+      <w:lvlJc w:val="left"/>
+      <w:pPr>
+        <w:ind w:left="2880" w:hanging="360"/>
+      </w:pPr>
+      <w:rPr>
+        <w:rFonts w:ascii="Symbol" w:hAnsi="Symbol" w:hint="default"/>
+      </w:rPr>
+    </w:lvl>
+    <w:lvl w:ilvl="4" w:tplc="08090003" w:tentative="1">
+      <w:start w:val="1"/>
+      <w:numFmt w:val="bullet"/>
+      <w:lvlText w:val="o"/>
+      <w:lvlJc w:val="left"/>
+      <w:pPr>
+        <w:ind w:left="3600" w:hanging="360"/>
+      </w:pPr>
+      <w:rPr>
+        <w:rFonts w:ascii="Courier New" w:hAnsi="Courier New" w:cs="Courier New" w:hint="default"/>
+      </w:rPr>
+    </w:lvl>
+    <w:lvl w:ilvl="5" w:tplc="08090005" w:tentative="1">
+      <w:start w:val="1"/>
+      <w:numFmt w:val="bullet"/>
+      <w:lvlText w:val=""/>
+      <w:lvlJc w:val="left"/>
+      <w:pPr>
+        <w:ind w:left="4320" w:hanging="360"/>
+      </w:pPr>
+      <w:rPr>
+        <w:rFonts w:ascii="Wingdings" w:hAnsi="Wingdings" w:hint="default"/>
+      </w:rPr>
+    </w:lvl>
+    <w:lvl w:ilvl="6" w:tplc="08090001" w:tentative="1">
+      <w:start w:val="1"/>
+      <w:numFmt w:val="bullet"/>
+      <w:lvlText w:val=""/>
+      <w:lvlJc w:val="left"/>
+      <w:pPr>
+        <w:ind w:left="5040" w:hanging="360"/>
+      </w:pPr>
+      <w:rPr>
+        <w:rFonts w:ascii="Symbol" w:hAnsi="Symbol" w:hint="default"/>
+      </w:rPr>
+    </w:lvl>
+    <w:lvl w:ilvl="7" w:tplc="08090003" w:tentative="1">
+      <w:start w:val="1"/>
+      <w:numFmt w:val="bullet"/>
+      <w:lvlText w:val="o"/>
+      <w:lvlJc w:val="left"/>
+      <w:pPr>
+        <w:ind w:left="5760" w:hanging="360"/>
+      </w:pPr>
+      <w:rPr>
+        <w:rFonts w:ascii="Courier New" w:hAnsi="Courier New" w:cs="Courier New" w:hint="default"/>
+      </w:rPr>
+    </w:lvl>
+    <w:lvl w:ilvl="8" w:tplc="08090005" w:tentative="1">
+      <w:start w:val="1"/>
+      <w:numFmt w:val="bullet"/>
+      <w:lvlText w:val=""/>
+      <w:lvlJc w:val="left"/>
+      <w:pPr>
+        <w:ind w:left="6480" w:hanging="360"/>
+      </w:pPr>
+      <w:rPr>
+        <w:rFonts w:ascii="Wingdings" w:hAnsi="Wingdings" w:hint="default"/>
+      </w:rPr>
+    </w:lvl>
+  </w:abstractNum>
+  <w:abstractNum w:abstractNumId="5" w15:restartNumberingAfterBreak="0">
     <w:nsid w:val="696222A5"/>
     <w:multiLevelType w:val="multilevel"/>
     <w:tmpl w:val="91608E00"/>
@@ -1186,7 +1731,7 @@
         <w:sz w:val="20"/>
       </w:rPr>
     </w:lvl>
-    <w:lvl w:ilvl="1" w:tentative="1">
+    <w:lvl w:ilvl="1">
       <w:start w:val="1"/>
       <w:numFmt w:val="bullet"/>
       <w:lvlText w:val="o"/>
@@ -1315,7 +1860,7 @@
       </w:rPr>
     </w:lvl>
   </w:abstractNum>
-  <w:abstractNum w:abstractNumId="3" w15:restartNumberingAfterBreak="0">
+  <w:abstractNum w:abstractNumId="6" w15:restartNumberingAfterBreak="0">
     <w:nsid w:val="708F0092"/>
     <w:multiLevelType w:val="multilevel"/>
     <w:tmpl w:val="09C2DCB4"/>
@@ -1351,7 +1896,7 @@
         <w:sz w:val="20"/>
       </w:rPr>
     </w:lvl>
-    <w:lvl w:ilvl="2" w:tentative="1">
+    <w:lvl w:ilvl="2">
       <w:start w:val="1"/>
       <w:numFmt w:val="bullet"/>
       <w:lvlText w:val=""/>
@@ -1367,7 +1912,7 @@
         <w:sz w:val="20"/>
       </w:rPr>
     </w:lvl>
-    <w:lvl w:ilvl="3" w:tentative="1">
+    <w:lvl w:ilvl="3">
       <w:start w:val="1"/>
       <w:numFmt w:val="bullet"/>
       <w:lvlText w:val=""/>
@@ -1383,7 +1928,7 @@
         <w:sz w:val="20"/>
       </w:rPr>
     </w:lvl>
-    <w:lvl w:ilvl="4" w:tentative="1">
+    <w:lvl w:ilvl="4">
       <w:start w:val="1"/>
       <w:numFmt w:val="bullet"/>
       <w:lvlText w:val=""/>
@@ -1399,7 +1944,7 @@
         <w:sz w:val="20"/>
       </w:rPr>
     </w:lvl>
-    <w:lvl w:ilvl="5" w:tentative="1">
+    <w:lvl w:ilvl="5">
       <w:start w:val="1"/>
       <w:numFmt w:val="bullet"/>
       <w:lvlText w:val=""/>
@@ -1415,7 +1960,7 @@
         <w:sz w:val="20"/>
       </w:rPr>
     </w:lvl>
-    <w:lvl w:ilvl="6" w:tentative="1">
+    <w:lvl w:ilvl="6">
       <w:start w:val="1"/>
       <w:numFmt w:val="bullet"/>
       <w:lvlText w:val=""/>
@@ -1431,7 +1976,7 @@
         <w:sz w:val="20"/>
       </w:rPr>
     </w:lvl>
-    <w:lvl w:ilvl="7" w:tentative="1">
+    <w:lvl w:ilvl="7">
       <w:start w:val="1"/>
       <w:numFmt w:val="bullet"/>
       <w:lvlText w:val=""/>
@@ -1447,7 +1992,7 @@
         <w:sz w:val="20"/>
       </w:rPr>
     </w:lvl>
-    <w:lvl w:ilvl="8" w:tentative="1">
+    <w:lvl w:ilvl="8">
       <w:start w:val="1"/>
       <w:numFmt w:val="bullet"/>
       <w:lvlText w:val=""/>
@@ -1464,23 +2009,32 @@
       </w:rPr>
     </w:lvl>
   </w:abstractNum>
-  <w:num w:numId="1">
+  <w:num w:numId="1" w16cid:durableId="1232042178">
     <w:abstractNumId w:val="0"/>
   </w:num>
-  <w:num w:numId="2">
+  <w:num w:numId="2" w16cid:durableId="828908398">
+    <w:abstractNumId w:val="6"/>
+  </w:num>
+  <w:num w:numId="3" w16cid:durableId="1500190730">
+    <w:abstractNumId w:val="2"/>
+  </w:num>
+  <w:num w:numId="4" w16cid:durableId="469910143">
+    <w:abstractNumId w:val="5"/>
+  </w:num>
+  <w:num w:numId="5" w16cid:durableId="82460887">
+    <w:abstractNumId w:val="1"/>
+  </w:num>
+  <w:num w:numId="6" w16cid:durableId="225344084">
     <w:abstractNumId w:val="3"/>
   </w:num>
-  <w:num w:numId="3">
-    <w:abstractNumId w:val="1"/>
-  </w:num>
-  <w:num w:numId="4">
-    <w:abstractNumId w:val="2"/>
+  <w:num w:numId="7" w16cid:durableId="1166290001">
+    <w:abstractNumId w:val="4"/>
   </w:num>
 </w:numbering>
 </file>
 
 <file path=word/styles.xml><?xml version="1.0" encoding="utf-8"?>
-<w:styles xmlns:mc="http://schemas.openxmlformats.org/markup-compatibility/2006" xmlns:r="http://schemas.openxmlformats.org/officeDocument/2006/relationships" xmlns:w="http://schemas.openxmlformats.org/wordprocessingml/2006/main" xmlns:w14="http://schemas.microsoft.com/office/word/2010/wordml" xmlns:w15="http://schemas.microsoft.com/office/word/2012/wordml" xmlns:w16cex="http://schemas.microsoft.com/office/word/2018/wordml/cex" xmlns:w16cid="http://schemas.microsoft.com/office/word/2016/wordml/cid" xmlns:w16="http://schemas.microsoft.com/office/word/2018/wordml" xmlns:w16sdtdh="http://schemas.microsoft.com/office/word/2020/wordml/sdtdatahash" xmlns:w16se="http://schemas.microsoft.com/office/word/2015/wordml/symex" mc:Ignorable="w14 w15 w16se w16cid w16 w16cex w16sdtdh">
+<w:styles xmlns:mc="http://schemas.openxmlformats.org/markup-compatibility/2006" xmlns:r="http://schemas.openxmlformats.org/officeDocument/2006/relationships" xmlns:w="http://schemas.openxmlformats.org/wordprocessingml/2006/main" xmlns:w14="http://schemas.microsoft.com/office/word/2010/wordml" xmlns:w15="http://schemas.microsoft.com/office/word/2012/wordml" xmlns:w16cex="http://schemas.microsoft.com/office/word/2018/wordml/cex" xmlns:w16cid="http://schemas.microsoft.com/office/word/2016/wordml/cid" xmlns:w16="http://schemas.microsoft.com/office/word/2018/wordml" xmlns:w16du="http://schemas.microsoft.com/office/word/2023/wordml/word16du" xmlns:w16sdtdh="http://schemas.microsoft.com/office/word/2020/wordml/sdtdatahash" xmlns:w16sdtfl="http://schemas.microsoft.com/office/word/2024/wordml/sdtformatlock" xmlns:w16se="http://schemas.microsoft.com/office/word/2015/wordml/symex" mc:Ignorable="w14 w15 w16se w16cid w16 w16cex w16sdtdh w16sdtfl w16du">
   <w:docDefaults>
     <w:rPrDefault>
       <w:rPr>
@@ -1901,7 +2455,6 @@
   <w:style w:type="character" w:default="1" w:styleId="DefaultParagraphFont">
     <w:name w:val="Default Paragraph Font"/>
     <w:uiPriority w:val="1"/>
-    <w:semiHidden/>
     <w:unhideWhenUsed/>
   </w:style>
   <w:style w:type="table" w:default="1" w:styleId="TableNormal">

</xml_diff>